<commit_message>
docs: update design documents and clean up project structure
</commit_message>
<xml_diff>
--- a/设计文档/原型图-claude0428/功能差异梳理-沟通意见.docx
+++ b/设计文档/原型图-claude0428/功能差异梳理-沟通意见.docx
@@ -154,8 +154,6 @@
           </wp:inline>
         </w:drawing>
       </w:r>
-      <w:bookmarkStart w:id="0" w:name="_GoBack"/>
-      <w:bookmarkEnd w:id="0"/>
     </w:p>
     <w:p>
       <w:pPr>
@@ -694,6 +692,8 @@
           </wp:inline>
         </w:drawing>
       </w:r>
+      <w:bookmarkStart w:id="0" w:name="_GoBack"/>
+      <w:bookmarkEnd w:id="0"/>
     </w:p>
     <w:p>
       <w:commentRangeStart w:id="9"/>
@@ -1552,7 +1552,7 @@
           <w:rFonts w:hint="eastAsia"/>
           <w:lang w:val="en-US" w:eastAsia="zh-CN"/>
         </w:rPr>
-        <w:t>调整页面</w:t>
+        <w:t>调整页面，直接删除tab页面</w:t>
       </w:r>
     </w:p>
   </w:comment>
@@ -1570,8 +1570,17 @@
           <w:rFonts w:hint="eastAsia"/>
           <w:lang w:val="en-US" w:eastAsia="zh-CN"/>
         </w:rPr>
-        <w:t>调整页面</w:t>
-      </w:r>
+        <w:t>调整页面，直接删除tab页面</w:t>
+      </w:r>
+    </w:p>
+    <w:p>
+      <w:pPr>
+        <w:pStyle w:val="2"/>
+        <w:rPr>
+          <w:rFonts w:hint="default" w:eastAsiaTheme="minorEastAsia"/>
+          <w:lang w:val="en-US" w:eastAsia="zh-CN"/>
+        </w:rPr>
+      </w:pPr>
     </w:p>
   </w:comment>
   <w:comment w:id="5" w:author="蝎子" w:date="2026-04-28T14:55:59Z" w:initials="">
@@ -1887,7 +1896,7 @@
   <w15:commentEx w15:paraId="0448C1BA" w15:done="0"/>
   <w15:commentEx w15:paraId="75C64E06" w15:done="0"/>
   <w15:commentEx w15:paraId="20CA770B" w15:done="0"/>
-  <w15:commentEx w15:paraId="267E9ACC" w15:done="0"/>
+  <w15:commentEx w15:paraId="0BC8E0DA" w15:done="0"/>
   <w15:commentEx w15:paraId="339C8616" w15:done="0"/>
   <w15:commentEx w15:paraId="4E731347" w15:done="0"/>
   <w15:commentEx w15:paraId="0B0C03CF" w15:done="0"/>

</xml_diff>